<commit_message>
Update PRD for today's changes: GUI redesign, settings backup, web_fetch
Documents the 0.2.0 GUI redesign, the 0.3.0 Google Drive settings
backup (and the uninstall incident that prompted it), the 0.3.1
web_fetch addition, and the public-repo audit/scrub - plus generalizes
the hardcoded example home location to match the new per-device config.
</commit_message>
<xml_diff>
--- a/Myday PRD.docx
+++ b/Myday PRD.docx
@@ -50,6 +50,14 @@
           <w:sz w:val="30"/>
         </w:rPr>
         <w:t>Relevant Documents</w:t>
+      </w:r>
+    </w:p>
+    <w:p>
+      <w:pPr>
+        <w:pStyle w:val="ListBullet"/>
+      </w:pPr>
+      <w:r>
+        <w:t>README.md (README.md) — public-repo-facing overview: what the app does, tech stack, and how to build it from a clean checkout.</w:t>
       </w:r>
     </w:p>
     <w:p>
@@ -2426,7 +2434,16 @@
         <w:t>Google integration</w:t>
       </w:r>
       <w:r>
-        <w:t>: OAuth 2.0 (Google Sign-In), Gmail API (read + labels/modify), Calendar API (read + free/busy + insert events).</w:t>
+        <w:t xml:space="preserve">: OAuth 2.0 (Google Sign-In), Gmail API (read + labels/modify), Calendar API (read + free/busy + insert events), Drive API (app-private </w:t>
+      </w:r>
+      <w:r>
+        <w:rPr>
+          <w:rFonts w:ascii="Consolas" w:hAnsi="Consolas"/>
+        </w:rPr>
+        <w:t>appDataFolder</w:t>
+      </w:r>
+      <w:r>
+        <w:t xml:space="preserve"> scope only, for settings backup — see below).</w:t>
       </w:r>
     </w:p>
     <w:p>
@@ -2451,10 +2468,28 @@
         <w:rPr>
           <w:b/>
         </w:rPr>
-        <w:t>Web search (built, 0.1.3)</w:t>
-      </w:r>
-      <w:r>
-        <w:t>: Anthropic's native, server-hosted web search tool, declared alongside every other tool in the same single tool-use call — not a second LLM pass. Runs entirely on Anthropic's servers and resolves within the same conversational turn, so it needed no new dispatch code in the app, only a data-model change to let the request's tool list hold a different shape alongside the app's own custom tools. Capped at 3 searches per request and biased toward Boaz's home area (Sonnenberg/Zurich, CH — a static approximation, not live GPS) for location-flavored questions. The system prompt establishes priority: a specific channel tool first, then Claude's own knowledge for anything it's already confident about, and web search only as a last resort for current/real-world information — since unlike everything else here, each search has a real per-use cost.</w:t>
+        <w:t>Web search + fetch (built, 0.1.3 / extended 0.3.1)</w:t>
+      </w:r>
+      <w:r>
+        <w:t xml:space="preserve">: Anthropic's native, server-hosted web search tool, declared alongside every other tool in the same single tool-use call — not a second LLM pass. Runs entirely on Anthropic's servers and resolves within the same conversational turn, so it needed no new dispatch code in the app, only a data-model change to let the request's tool list hold a different shape alongside the app's own custom tools. Capped at 3 searches per request and biased toward Boaz's home area (a static approximation from his configured home location, not live GPS) for location-flavored questions. </w:t>
+      </w:r>
+      <w:r>
+        <w:rPr>
+          <w:b/>
+        </w:rPr>
+        <w:t>0.3.1</w:t>
+      </w:r>
+      <w:r>
+        <w:t xml:space="preserve"> added Anthropic's </w:t>
+      </w:r>
+      <w:r>
+        <w:rPr>
+          <w:rFonts w:ascii="Consolas" w:hAnsi="Consolas"/>
+        </w:rPr>
+        <w:t>web_fetch</w:t>
+      </w:r>
+      <w:r>
+        <w:t xml:space="preserve"> tool alongside it (still beta, needs its own opt-in API header): a search result's snippet is often too short to answer something like an exact current standings table or ranked list, so Claude now follows up a promising search hit by fetching that page's actual content — verified live against a real query. The system prompt establishes priority: a specific channel tool first, then Claude's own knowledge for anything it's already confident about, then web search/fetch only as a last resort for current/real-world information — since unlike everything else here, each search or fetch has a real per-use cost.</w:t>
       </w:r>
     </w:p>
     <w:p>
@@ -2479,10 +2514,33 @@
         <w:rPr>
           <w:b/>
         </w:rPr>
+        <w:t>Settings backup (built, 0.3.0)</w:t>
+      </w:r>
+      <w:r>
+        <w:t xml:space="preserve">: the Promotion Allowlist, Junk Blacklist, and Named Locations are written to the signed-in Google account's private Drive </w:t>
+      </w:r>
+      <w:r>
+        <w:rPr>
+          <w:rFonts w:ascii="Consolas" w:hAnsi="Consolas"/>
+        </w:rPr>
+        <w:t>appDataFolder</w:t>
+      </w:r>
+      <w:r>
+        <w:t xml:space="preserve"> on every save, and restored automatically on startup if found empty locally. Built after a real incident (see Risks) where an app uninstall during debugging silently erased this data with no warning; deliberately excludes the Anthropic API key (worth re-entering by hand rather than carrying a live credential into a backup file).</w:t>
+      </w:r>
+    </w:p>
+    <w:p>
+      <w:pPr>
+        <w:pStyle w:val="ListBullet"/>
+      </w:pPr>
+      <w:r>
+        <w:rPr>
+          <w:b/>
+        </w:rPr>
         <w:t>Weather</w:t>
       </w:r>
       <w:r>
-        <w:t xml:space="preserve">: Open-Meteo (no API key required) for Sonnenberg, 8703, Switzerland — both the </w:t>
+        <w:t xml:space="preserve">: Open-Meteo (no API key required) for Boaz's configured home location — both the </w:t>
       </w:r>
       <w:r>
         <w:rPr>
@@ -2509,7 +2567,16 @@
         <w:t>hourly</w:t>
       </w:r>
       <w:r>
-        <w:t xml:space="preserve"> forecast fields (today's low/high, precipitation probability and type, and timing) so Claude can produce a genuinely useful readout, including an umbrella recommendation, not just a temperature.</w:t>
+        <w:t xml:space="preserve"> forecast fields (today's low/high, precipitation probability and type, and timing) so Claude can produce a genuinely useful readout, including an umbrella recommendation, not just a temperature. The actual coordinates/city are per-device build configuration (</w:t>
+      </w:r>
+      <w:r>
+        <w:rPr>
+          <w:rFonts w:ascii="Consolas" w:hAnsi="Consolas"/>
+        </w:rPr>
+        <w:t>local.properties</w:t>
+      </w:r>
+      <w:r>
+        <w:t>), not hardcoded, since the source is a public repo.</w:t>
       </w:r>
     </w:p>
     <w:p>
@@ -2790,6 +2857,20 @@
         <w:rPr>
           <w:b/>
         </w:rPr>
+        <w:t>Uninstall wipes app data with no warning (realized, mitigated)</w:t>
+      </w:r>
+      <w:r>
+        <w:t>: on 2026-08-29, uninstalling the app during debugging silently erased the Promotion Allowlist and Junk Blacklist — Android wipes all app data unconditionally on uninstall, and neither list had ever been given a backup path. Root-caused via direct on-device DataStore inspection rather than assumption. Mitigated in 0.3.0 with automatic Google Drive backup of Settings-menu data (see Technical Architecture) — write-on-save, restore-on-empty, chosen over Android's built-in Auto Backup after confirming that mechanism hadn't actually restored this data post-uninstall.</w:t>
+      </w:r>
+    </w:p>
+    <w:p>
+      <w:pPr>
+        <w:pStyle w:val="ListBullet"/>
+      </w:pPr>
+      <w:r>
+        <w:rPr>
+          <w:b/>
+        </w:rPr>
         <w:t>No speaker verification until V4 (accepted risk)</w:t>
       </w:r>
       <w:r>
@@ -2909,7 +2990,7 @@
         <w:pStyle w:val="ListBullet"/>
       </w:pPr>
       <w:r>
-        <w:t>Fetch and read back today's Calendar events and the weather for Sonnenberg, 8703, Switzerland — including today's low and high temperature, chance of rain, type of precipitation (e.g. thunderstorm, shower, light rain), roughly when in the day it's expected, and a take-an-umbrella-or-not recommendation.</w:t>
+        <w:t>Fetch and read back today's Calendar events and the weather for Boaz's configured home location — including today's low and high temperature, chance of rain, type of precipitation (e.g. thunderstorm, shower, light rain), roughly when in the day it's expected, and a take-an-umbrella-or-not recommendation.</w:t>
       </w:r>
     </w:p>
     <w:p>
@@ -3195,7 +3276,7 @@
         <w:t>Data sources</w:t>
       </w:r>
       <w:r>
-        <w:t xml:space="preserve">: Gmail API (message metadata + body for the last 24h), Google Calendar API (today's events, free/busy), Open-Meteo (weather for Sonnenberg, 8703, CH), WhatsApp notification text (captured live via </w:t>
+        <w:t xml:space="preserve">: Gmail API (message metadata + body for the last 24h), Google Calendar API (today's events, free/busy), Google Drive API (app-private settings backup only), Open-Meteo (weather for Boaz's configured home location), WhatsApp notification text (captured live via </w:t>
       </w:r>
       <w:r>
         <w:rPr>
@@ -3204,7 +3285,7 @@
         <w:t>NotificationListenerService</w:t>
       </w:r>
       <w:r>
-        <w:t>, stored locally), and — for general questions outside all of the above — Anthropic's own hosted web search tool, capped and used only as a fallback (see Technical Architecture).</w:t>
+        <w:t>, stored locally), and — for general questions outside all of the above — Anthropic's own hosted web search and web-fetch tools, capped and used only as a fallback (see Technical Architecture).</w:t>
       </w:r>
     </w:p>
     <w:p>
@@ -3832,6 +3913,17 @@
         <w:rPr>
           <w:b/>
         </w:rPr>
+        <w:t>GUI redesign (built, 0.2.0)</w:t>
+      </w:r>
+      <w:r>
+        <w:t>: before sharing with anyone, the original UI — a single long scrolling column mixing the one button anyone actually taps daily with permission grants, an API key field, list editors, and manual test buttons — was replaced with a proper app shell: a hamburger drawer for navigation, a bottom nav bar for the few things used constantly, one consolidated Authorization screen (every grant Myday needs in one place, as close to "one button" as Android's permission/OAuth/special-access model actually allows), and a clean home screen (status, weather, summary counts, a live activity feed of what Myday's AI has actually done). A prerequisite for handing the app to someone who isn't Boaz and didn't build it.</w:t>
+      </w:r>
+    </w:p>
+    <w:p>
+      <w:r>
+        <w:rPr>
+          <w:b/>
+        </w:rPr>
         <w:t>Sharing with other people (built, first friend onboarding in progress)</w:t>
       </w:r>
       <w:r>
@@ -3869,6 +3961,17 @@
       </w:pPr>
       <w:r>
         <w:t>They sideload it, grant the same permissions Boaz did, sign in with their own Google account, and create their own free Anthropic API key rather than using Boaz's — see the Anthropic API key entry under Technical Architecture. This is what makes per-person sharing possible without Boaz paying for or exposing his own account: no backend, no shared credentials, each installation is fully self-contained to the person running it.</w:t>
+      </w:r>
+    </w:p>
+    <w:p>
+      <w:r>
+        <w:rPr>
+          <w:b/>
+        </w:rPr>
+        <w:t>Source code, public on GitHub (built)</w:t>
+      </w:r>
+      <w:r>
+        <w:t>: separate from app distribution above, the source repository itself (github.com/boazgruener-ai/MyDay (https://github.com/boazgruener-ai/MyDay)) is public, for portfolio/CV purposes — this is a code-visibility decision, not a distribution one; the APK itself is still only shared directly with trusted testers per the process above, and nothing about the OAuth "Testing" status or Play Store readiness below changes. Before making the repo public, it was audited and scrubbed: no API keys or OAuth secrets were ever tracked in git; a hardcoded home town/postal code and a real contact's name (both incidental to comments/docs, not functional) were found and moved to per-device config or genericized; git history was reset to a single clean commit so the original values aren't recoverable from history either.</w:t>
       </w:r>
     </w:p>
     <w:p>

</xml_diff>